<commit_message>
Update User Guide and Admin guide
</commit_message>
<xml_diff>
--- a/ADMIN_GUIDE.docx
+++ b/ADMIN_GUIDE.docx
@@ -125,6 +125,545 @@
       </w:pPr>
       <w:r>
         <w:t>Health Endpoints: Query /api/health or /api/ping to verify the backend is responsive and CV models loaded correctly.</w:t>
+      </w:r>
+    </w:p>
+    <w:p/>
+    <w:p>
+      <w:pPr>
+        <w:pStyle w:val="ListNumber"/>
+      </w:pPr>
+      <w:r>
+        <w:rPr>
+          <w:b/>
+          <w:sz w:val="24"/>
+        </w:rPr>
+        <w:t>User Accounts &amp; Sign-In</w:t>
+      </w:r>
+    </w:p>
+    <w:p>
+      <w:pPr>
+        <w:pStyle w:val="ListBullet"/>
+      </w:pPr>
+      <w:r>
+        <w:t>PSAT uses a local profile system. Each user creates a named profile secured by a 4–12 digit PIN. Profiles and their associated projects persist on disk — users can always sign back in on the same device to access their previously saved projects.</w:t>
+      </w:r>
+    </w:p>
+    <w:p>
+      <w:pPr>
+        <w:pStyle w:val="ListBullet"/>
+      </w:pPr>
+      <w:r>
+        <w:rPr>
+          <w:b/>
+          <w:sz w:val="22"/>
+        </w:rPr>
+        <w:t>How a user signs in</w:t>
+      </w:r>
+    </w:p>
+    <w:p>
+      <w:pPr>
+        <w:pStyle w:val="ListBullet"/>
+      </w:pPr>
+      <w:r>
+        <w:rPr>
+          <w:b/>
+        </w:rPr>
+        <w:t xml:space="preserve">1. Open PSAT. </w:t>
+      </w:r>
+      <w:r>
+        <w:t>The Landing Page shows all profiles registered on this device.</w:t>
+      </w:r>
+    </w:p>
+    <w:p>
+      <w:pPr>
+        <w:pStyle w:val="ListBullet"/>
+      </w:pPr>
+      <w:r>
+        <w:rPr>
+          <w:b/>
+        </w:rPr>
+        <w:t xml:space="preserve">2. Select your profile </w:t>
+      </w:r>
+      <w:r>
+        <w:t>from the list on the right-hand panel.</w:t>
+      </w:r>
+    </w:p>
+    <w:p>
+      <w:pPr>
+        <w:pStyle w:val="ListBullet"/>
+      </w:pPr>
+      <w:r>
+        <w:rPr>
+          <w:b/>
+        </w:rPr>
+        <w:t xml:space="preserve">3. Click "Start As &lt;Name&gt;". </w:t>
+      </w:r>
+      <w:r>
+        <w:t>A PIN prompt appears if this is not the currently active session.</w:t>
+      </w:r>
+    </w:p>
+    <w:p>
+      <w:pPr>
+        <w:pStyle w:val="ListBullet"/>
+      </w:pPr>
+      <w:r>
+        <w:rPr>
+          <w:b/>
+        </w:rPr>
+        <w:t xml:space="preserve">4. Enter your PIN </w:t>
+      </w:r>
+      <w:r>
+        <w:t>and click the confirmation button. You are now logged in.</w:t>
+      </w:r>
+    </w:p>
+    <w:p>
+      <w:pPr>
+        <w:pStyle w:val="ListBullet"/>
+      </w:pPr>
+      <w:r>
+        <w:rPr>
+          <w:b/>
+        </w:rPr>
+        <w:t xml:space="preserve">5. Your projects appear </w:t>
+      </w:r>
+      <w:r>
+        <w:t>on the Projects page (Home). All previously saved work is available immediately.</w:t>
+      </w:r>
+    </w:p>
+    <w:p>
+      <w:pPr>
+        <w:pStyle w:val="ListBullet"/>
+      </w:pPr>
+      <w:r>
+        <w:rPr>
+          <w:b/>
+          <w:sz w:val="22"/>
+        </w:rPr>
+        <w:t>Creating a new account</w:t>
+      </w:r>
+    </w:p>
+    <w:p>
+      <w:pPr>
+        <w:pStyle w:val="ListBullet"/>
+      </w:pPr>
+      <w:r>
+        <w:rPr>
+          <w:b/>
+        </w:rPr>
+        <w:t xml:space="preserve">1. On the Landing Page, </w:t>
+      </w:r>
+      <w:r>
+        <w:t>click "Create Profile".</w:t>
+      </w:r>
+    </w:p>
+    <w:p>
+      <w:pPr>
+        <w:pStyle w:val="ListBullet"/>
+      </w:pPr>
+      <w:r>
+        <w:rPr>
+          <w:b/>
+        </w:rPr>
+        <w:t xml:space="preserve">2. Enter a profile name, </w:t>
+      </w:r>
+      <w:r>
+        <w:t>your division, and a 4–12 digit numeric PIN.</w:t>
+      </w:r>
+    </w:p>
+    <w:p>
+      <w:pPr>
+        <w:pStyle w:val="ListBullet"/>
+      </w:pPr>
+      <w:r>
+        <w:rPr>
+          <w:b/>
+        </w:rPr>
+        <w:t xml:space="preserve">3. Click "Create Profile". </w:t>
+      </w:r>
+      <w:r>
+        <w:t>The profile is saved and you are automatically logged in.</w:t>
+      </w:r>
+    </w:p>
+    <w:p>
+      <w:pPr>
+        <w:pStyle w:val="ListBullet"/>
+      </w:pPr>
+      <w:r>
+        <w:rPr>
+          <w:b/>
+          <w:sz w:val="22"/>
+        </w:rPr>
+        <w:t>Switching accounts</w:t>
+      </w:r>
+    </w:p>
+    <w:p>
+      <w:pPr>
+        <w:pStyle w:val="ListBullet"/>
+      </w:pPr>
+      <w:r>
+        <w:t>Click "Log Out" in the sidebar at any time. You are returned to the Landing Page, where you can select a different profile.</w:t>
+      </w:r>
+    </w:p>
+    <w:p>
+      <w:pPr>
+        <w:pStyle w:val="ListBullet"/>
+      </w:pPr>
+      <w:r>
+        <w:rPr>
+          <w:i/>
+        </w:rPr>
+        <w:t>Note: The active session is device-local. Each browser tab / app window shares the same active profile on that device. Logging out from one window affects all open tabs.</w:t>
+      </w:r>
+    </w:p>
+    <w:p/>
+    <w:p>
+      <w:pPr>
+        <w:pStyle w:val="ListNumber"/>
+      </w:pPr>
+      <w:r>
+        <w:rPr>
+          <w:b/>
+          <w:sz w:val="24"/>
+        </w:rPr>
+        <w:t>Admin Dashboard — Usage Tracking</w:t>
+      </w:r>
+    </w:p>
+    <w:p>
+      <w:pPr>
+        <w:pStyle w:val="ListBullet"/>
+      </w:pPr>
+      <w:r>
+        <w:t>The Admin Dashboard lets you monitor usage without needing to be physically present. It shows total accounts created, logins today, all-time login totals, a daily login bar chart, and a per-account breakdown.</w:t>
+      </w:r>
+    </w:p>
+    <w:p>
+      <w:pPr>
+        <w:pStyle w:val="ListBullet"/>
+      </w:pPr>
+      <w:r>
+        <w:rPr>
+          <w:b/>
+          <w:sz w:val="22"/>
+        </w:rPr>
+        <w:t>Accessing the Admin Dashboard</w:t>
+      </w:r>
+    </w:p>
+    <w:p>
+      <w:pPr>
+        <w:pStyle w:val="ListBullet"/>
+      </w:pPr>
+      <w:r>
+        <w:rPr>
+          <w:b/>
+        </w:rPr>
+        <w:t xml:space="preserve">1. Log in </w:t>
+      </w:r>
+      <w:r>
+        <w:t>to any profile on the device.</w:t>
+      </w:r>
+    </w:p>
+    <w:p>
+      <w:pPr>
+        <w:pStyle w:val="ListBullet"/>
+      </w:pPr>
+      <w:r>
+        <w:rPr>
+          <w:b/>
+        </w:rPr>
+        <w:t xml:space="preserve">2. Navigate to the Projects page (Home). </w:t>
+      </w:r>
+      <w:r/>
+    </w:p>
+    <w:p>
+      <w:pPr>
+        <w:pStyle w:val="ListBullet"/>
+      </w:pPr>
+      <w:r>
+        <w:rPr>
+          <w:b/>
+        </w:rPr>
+        <w:t xml:space="preserve">3. Click "Admin Dashboard" </w:t>
+      </w:r>
+      <w:r>
+        <w:t>in the lower section of the left-hand sidebar.</w:t>
+      </w:r>
+    </w:p>
+    <w:p>
+      <w:pPr>
+        <w:pStyle w:val="ListBullet"/>
+      </w:pPr>
+      <w:r>
+        <w:rPr>
+          <w:b/>
+        </w:rPr>
+        <w:t xml:space="preserve">4. The dashboard loads immediately </w:t>
+      </w:r>
+      <w:r>
+        <w:t>with live data from the local database.</w:t>
+      </w:r>
+    </w:p>
+    <w:p>
+      <w:pPr>
+        <w:pStyle w:val="ListBullet"/>
+      </w:pPr>
+      <w:r>
+        <w:rPr>
+          <w:i/>
+        </w:rPr>
+        <w:t>Note: The Admin Dashboard is accessible to any user who can reach the PSAT URL. It does not require a separate admin PIN. Restrict network access to control who can view it.</w:t>
+      </w:r>
+    </w:p>
+    <w:p>
+      <w:pPr>
+        <w:pStyle w:val="ListBullet"/>
+      </w:pPr>
+      <w:r>
+        <w:rPr>
+          <w:b/>
+          <w:sz w:val="22"/>
+        </w:rPr>
+        <w:t>Reading the summary cards</w:t>
+      </w:r>
+    </w:p>
+    <w:p>
+      <w:pPr>
+        <w:pStyle w:val="ListBullet"/>
+      </w:pPr>
+      <w:r>
+        <w:t>Three cards appear at the top of the dashboard:</w:t>
+      </w:r>
+    </w:p>
+    <w:p>
+      <w:pPr>
+        <w:pStyle w:val="ListBullet"/>
+      </w:pPr>
+      <w:r>
+        <w:rPr>
+          <w:b/>
+        </w:rPr>
+        <w:t xml:space="preserve">1. Total Accounts Created — </w:t>
+      </w:r>
+      <w:r>
+        <w:t>the number of profiles registered on this installation.</w:t>
+      </w:r>
+    </w:p>
+    <w:p>
+      <w:pPr>
+        <w:pStyle w:val="ListBullet"/>
+      </w:pPr>
+      <w:r>
+        <w:rPr>
+          <w:b/>
+        </w:rPr>
+        <w:t xml:space="preserve">2. Logins Today — </w:t>
+      </w:r>
+      <w:r>
+        <w:t>successful sign-in events recorded since midnight UTC on this device.</w:t>
+      </w:r>
+    </w:p>
+    <w:p>
+      <w:pPr>
+        <w:pStyle w:val="ListBullet"/>
+      </w:pPr>
+      <w:r>
+        <w:rPr>
+          <w:b/>
+        </w:rPr>
+        <w:t xml:space="preserve">3. Total Logins (All Time) — </w:t>
+      </w:r>
+      <w:r>
+        <w:t>the cumulative count of all login events ever recorded.</w:t>
+      </w:r>
+    </w:p>
+    <w:p>
+      <w:pPr>
+        <w:pStyle w:val="ListBullet"/>
+      </w:pPr>
+      <w:r>
+        <w:rPr>
+          <w:b/>
+          <w:sz w:val="22"/>
+        </w:rPr>
+        <w:t>Daily login chart</w:t>
+      </w:r>
+    </w:p>
+    <w:p>
+      <w:pPr>
+        <w:pStyle w:val="ListBullet"/>
+      </w:pPr>
+      <w:r>
+        <w:t>The bar chart shows login frequency over a rolling window. Use the day-range tabs (7d / 14d / 30d / 90d) above the chart to change the period. Each bar represents one calendar day; hover to see the exact count.</w:t>
+      </w:r>
+    </w:p>
+    <w:p>
+      <w:pPr>
+        <w:pStyle w:val="ListBullet"/>
+      </w:pPr>
+      <w:r>
+        <w:rPr>
+          <w:b/>
+          <w:sz w:val="22"/>
+        </w:rPr>
+        <w:t>All Accounts table</w:t>
+      </w:r>
+    </w:p>
+    <w:p>
+      <w:pPr>
+        <w:pStyle w:val="ListBullet"/>
+      </w:pPr>
+      <w:r>
+        <w:t>Below the chart, a table lists every registered profile with the following columns:</w:t>
+      </w:r>
+    </w:p>
+    <w:p>
+      <w:pPr>
+        <w:pStyle w:val="ListBullet"/>
+      </w:pPr>
+      <w:r>
+        <w:rPr>
+          <w:b/>
+        </w:rPr>
+        <w:t xml:space="preserve">1. Name — </w:t>
+      </w:r>
+      <w:r>
+        <w:t>the display name of the profile.</w:t>
+      </w:r>
+    </w:p>
+    <w:p>
+      <w:pPr>
+        <w:pStyle w:val="ListBullet"/>
+      </w:pPr>
+      <w:r>
+        <w:rPr>
+          <w:b/>
+        </w:rPr>
+        <w:t xml:space="preserve">2. Division — </w:t>
+      </w:r>
+      <w:r>
+        <w:t>the team or department entered at account creation.</w:t>
+      </w:r>
+    </w:p>
+    <w:p>
+      <w:pPr>
+        <w:pStyle w:val="ListBullet"/>
+      </w:pPr>
+      <w:r>
+        <w:rPr>
+          <w:b/>
+        </w:rPr>
+        <w:t xml:space="preserve">3. Projects — </w:t>
+      </w:r>
+      <w:r>
+        <w:t>the number of projects currently saved under this profile.</w:t>
+      </w:r>
+    </w:p>
+    <w:p>
+      <w:pPr>
+        <w:pStyle w:val="ListBullet"/>
+      </w:pPr>
+      <w:r>
+        <w:rPr>
+          <w:b/>
+        </w:rPr>
+        <w:t xml:space="preserve">4. Logins — </w:t>
+      </w:r>
+      <w:r>
+        <w:t>the total number of times this account has logged in (all time).</w:t>
+      </w:r>
+    </w:p>
+    <w:p>
+      <w:pPr>
+        <w:pStyle w:val="ListBullet"/>
+      </w:pPr>
+      <w:r>
+        <w:rPr>
+          <w:b/>
+        </w:rPr>
+        <w:t xml:space="preserve">5. Created — </w:t>
+      </w:r>
+      <w:r>
+        <w:t>the date and time the profile was created.</w:t>
+      </w:r>
+    </w:p>
+    <w:p>
+      <w:pPr>
+        <w:pStyle w:val="ListBullet"/>
+      </w:pPr>
+      <w:r>
+        <w:rPr>
+          <w:b/>
+        </w:rPr>
+        <w:t xml:space="preserve">6. Last Active — </w:t>
+      </w:r>
+      <w:r>
+        <w:t>the date and time of the most recent login or action.</w:t>
+      </w:r>
+    </w:p>
+    <w:p>
+      <w:pPr>
+        <w:pStyle w:val="ListBullet"/>
+      </w:pPr>
+      <w:r>
+        <w:rPr>
+          <w:b/>
+          <w:sz w:val="22"/>
+        </w:rPr>
+        <w:t>Refreshing the data</w:t>
+      </w:r>
+    </w:p>
+    <w:p>
+      <w:pPr>
+        <w:pStyle w:val="ListBullet"/>
+      </w:pPr>
+      <w:r>
+        <w:t>Click the "⟳ Refresh" button at the top right of the dashboard to reload the latest data from the database without leaving the page.</w:t>
+      </w:r>
+    </w:p>
+    <w:p>
+      <w:pPr>
+        <w:pStyle w:val="ListBullet"/>
+      </w:pPr>
+      <w:r>
+        <w:rPr>
+          <w:b/>
+          <w:sz w:val="22"/>
+        </w:rPr>
+        <w:t>Remote access (without being physically present)</w:t>
+      </w:r>
+    </w:p>
+    <w:p>
+      <w:pPr>
+        <w:pStyle w:val="ListBullet"/>
+      </w:pPr>
+      <w:r>
+        <w:t>If PSAT is deployed on a shared server or behind a VPN, the Admin Dashboard is accessible from any machine that can reach the PSAT web address. Navigate to:</w:t>
+      </w:r>
+    </w:p>
+    <w:p>
+      <w:pPr>
+        <w:pStyle w:val="ListBullet"/>
+      </w:pPr>
+      <w:r>
+        <w:t xml:space="preserve">    http://&lt;server-address&gt;:&lt;port&gt;/admin</w:t>
+      </w:r>
+    </w:p>
+    <w:p>
+      <w:pPr>
+        <w:pStyle w:val="ListBullet"/>
+      </w:pPr>
+      <w:r>
+        <w:t>No additional login is required — the page loads immediately. For security, ensure that network-level access controls (firewall, VPN) restrict who can reach the PSAT server.</w:t>
+      </w:r>
+    </w:p>
+    <w:p>
+      <w:pPr>
+        <w:pStyle w:val="ListBullet"/>
+      </w:pPr>
+      <w:r>
+        <w:rPr>
+          <w:i/>
+        </w:rPr>
+        <w:t>Note: All login events are stored in profiles/telemetry.sqlite3 on the server. This file can also be queried directly with any SQLite client (e.g. DB Browser for SQLite) for custom reports. The relevant table is activity_events; filter on event_type = "profile_login".</w:t>
       </w:r>
     </w:p>
     <w:sectPr>

</xml_diff>